<commit_message>
Actualizar metricas LSM y keypoints
</commit_message>
<xml_diff>
--- a/docs/protocolos/protocolo_LSM_v25.docx
+++ b/docs/protocolos/protocolo_LSM_v25.docx
@@ -890,6 +890,65 @@
     </w:p>
     <w:p>
       <w:pPr>
+        <w:jc w:val="both"/>
+      </w:pPr>
+      <w:r>
+        <w:rPr>
+          <w:rFonts w:ascii="Times New Roman" w:hAnsi="Times New Roman"/>
+          <w:sz w:val="24"/>
+        </w:rPr>
+        <w:t>Resultados actualizados del repositorio (4 de septiembre de 2026): el modelo estático de abecedario evaluó 21 letras y obtuvo 98.78% de accuracy y 98.79% de macro-F1 en 41,773 muestras de prueba. El modelo dinámico evaluó J, K, Ñ, Q, X y Z con secuencias de 30 cuadros y 126 características por cuadro; obtuvo 96.67% de accuracy y 96.63% de macro-F1 en 120 muestras. En la matriz dinámica, J, K, Q, Z y Ñ acertaron 20 de 20 muestras cada una; X acertó 16 de 20 y se confundió cuatro veces con Q. En conjunto, el repositorio reporta modelos para 27 letras, pero las cifras deben mantenerse separadas por tarea. Estos resultados describen checkpoints evaluados y no demuestran todavía una traducción de extremo a extremo dentro de la interfaz.</w:t>
+      </w:r>
+    </w:p>
+    <w:p>
+      <w:pPr>
+        <w:jc w:val="both"/>
+      </w:pPr>
+      <w:r>
+        <w:t>Figura. Ejemplos de keypoints 3D extraídos para las letras A–F del abecedario LSM.</w:t>
+      </w:r>
+    </w:p>
+    <w:p>
+      <w:pPr>
+        <w:jc w:val="center"/>
+      </w:pPr>
+      <w:r>
+        <w:drawing>
+          <wp:inline xmlns:a="http://schemas.openxmlformats.org/drawingml/2006/main" xmlns:pic="http://schemas.openxmlformats.org/drawingml/2006/picture">
+            <wp:extent cx="5486400" cy="3605053"/>
+            <wp:docPr id="9" name="Picture 9"/>
+            <wp:cNvGraphicFramePr>
+              <a:graphicFrameLocks noChangeAspect="1"/>
+            </wp:cNvGraphicFramePr>
+            <a:graphic>
+              <a:graphicData uri="http://schemas.openxmlformats.org/drawingml/2006/picture">
+                <pic:pic>
+                  <pic:nvPicPr>
+                    <pic:cNvPr id="0" name="keypoints_abecedario_lsm.png"/>
+                    <pic:cNvPicPr/>
+                  </pic:nvPicPr>
+                  <pic:blipFill>
+                    <a:blip r:embed="rId47"/>
+                    <a:stretch>
+                      <a:fillRect/>
+                    </a:stretch>
+                  </pic:blipFill>
+                  <pic:spPr>
+                    <a:xfrm>
+                      <a:off x="0" y="0"/>
+                      <a:ext cx="5486400" cy="3605053"/>
+                    </a:xfrm>
+                    <a:prstGeom prst="rect"/>
+                  </pic:spPr>
+                </pic:pic>
+              </a:graphicData>
+            </a:graphic>
+          </wp:inline>
+        </w:drawing>
+      </w:r>
+    </w:p>
+    <w:p>
+      <w:pPr>
         <w:spacing w:after="120" w:before="0" w:line="360" w:lineRule="auto"/>
         <w:jc w:val="both"/>
       </w:pPr>
@@ -5927,6 +5986,45 @@
       </w:pPr>
       <w:r>
         <w:rPr>
+          <w:rFonts w:ascii="Times New Roman" w:hAnsi="Times New Roman"/>
+          <w:sz w:val="24"/>
+        </w:rPr>
+        <w:t>1) Abecedario (PyTorch, TCN). Resultado actualizado: 21 letras evaluadas, 98.78% de accuracy y 98.79% de macro-F1 en prueba (41,773 muestras).</w:t>
+      </w:r>
+    </w:p>
+    <w:p>
+      <w:pPr>
+        <w:spacing w:after="120" w:before="0" w:line="360" w:lineRule="auto"/>
+        <w:jc w:val="both"/>
+      </w:pPr>
+      <w:r>
+        <w:rPr>
+          <w:rFonts w:ascii="Times New Roman" w:hAnsi="Times New Roman"/>
+          <w:sz w:val="24"/>
+        </w:rPr>
+        <w:t>2) Vocabulario “successor_positions126” (PyTorch, TCN). El experimento anterior de 249 etiquetas obtuvo 0% en prueba y no debe mezclarse con el modelo dinámico actualizado.</w:t>
+      </w:r>
+    </w:p>
+    <w:p>
+      <w:pPr>
+        <w:spacing w:after="120" w:before="0" w:line="360" w:lineRule="auto"/>
+        <w:jc w:val="both"/>
+      </w:pPr>
+      <w:r>
+        <w:rPr>
+          <w:rFonts w:ascii="Times New Roman" w:hAnsi="Times New Roman"/>
+          <w:sz w:val="24"/>
+        </w:rPr>
+        <w:t>3) MSL-ABC (PyTorch, TCN). El entrenamiento inicial de 74 clases fue interrumpido; sus cifras no representan el resultado final de 21 letras actualizado.</w:t>
+      </w:r>
+    </w:p>
+    <w:p>
+      <w:pPr>
+        <w:spacing w:after="120" w:before="0" w:line="360" w:lineRule="auto"/>
+        <w:jc w:val="both"/>
+      </w:pPr>
+      <w:r>
+        <w:rPr>
           <w:rFonts w:ascii="Times New Roman" w:cs="Times New Roman" w:eastAsia="Times New Roman" w:hAnsi="Times New Roman"/>
           <w:b w:val="false"/>
           <w:bCs w:val="false"/>
@@ -5935,60 +6033,6 @@
           <w:sz w:val="24"/>
           <w:szCs w:val="24"/>
         </w:rPr>
-        <w:t xml:space="preserve">1) Abecedario (TensorFlow/Keras, Conv1D+BiLSTM). Primer prototipo, con suficientes datos por clase (6,692 muestras de entrenamiento sobre 26 clases). Es el único de los tres con accuracy alto (98.60% en prueba); también es el más antiguo y ya no se sigue desarrollando.</w:t>
-      </w:r>
-    </w:p>
-    <w:p>
-      <w:pPr>
-        <w:spacing w:after="120" w:before="0" w:line="360" w:lineRule="auto"/>
-        <w:jc w:val="both"/>
-      </w:pPr>
-      <w:r>
-        <w:rPr>
-          <w:rFonts w:ascii="Times New Roman" w:cs="Times New Roman" w:eastAsia="Times New Roman" w:hAnsi="Times New Roman"/>
-          <w:b w:val="false"/>
-          <w:bCs w:val="false"/>
-          <w:i w:val="false"/>
-          <w:iCs w:val="false"/>
-          <w:sz w:val="24"/>
-          <w:szCs w:val="24"/>
-        </w:rPr>
-        <w:t xml:space="preserve">2) Vocabulario “successor_positions126” (PyTorch, TCN). Primer intento de escalar de letras a palabras completas (249 etiquetas). Con solo 1,675 muestras de entrenamiento (6.7 por clase en promedio) el modelo no generalizó: 0% de accuracy en prueba. Es la arquitectura vigente de investigación, aunque este experimento particular no dio resultado.</w:t>
-      </w:r>
-    </w:p>
-    <w:p>
-      <w:pPr>
-        <w:spacing w:after="120" w:before="0" w:line="360" w:lineRule="auto"/>
-        <w:jc w:val="both"/>
-      </w:pPr>
-      <w:r>
-        <w:rPr>
-          <w:rFonts w:ascii="Times New Roman" w:cs="Times New Roman" w:eastAsia="Times New Roman" w:hAnsi="Times New Roman"/>
-          <w:b w:val="false"/>
-          <w:bCs w:val="false"/>
-          <w:i w:val="false"/>
-          <w:iCs w:val="false"/>
-          <w:sz w:val="24"/>
-          <w:szCs w:val="24"/>
-        </w:rPr>
-        <w:t xml:space="preserve">3) MSL-ABC (PyTorch, TCN). Intento de repetir el experimento anterior con un dataset mucho mayor (279,716 imágenes, 74 clases) para probar si la falta de datos era la causa del fallo. El entrenamiento se cortó durante la primera época a petición del equipo, con accuracy de 4.8% y macro-F1 de 0.038; no alcanza a mostrar si más datos habrían resuelto el problema porque no se dejó correr lo suficiente.</w:t>
-      </w:r>
-    </w:p>
-    <w:p>
-      <w:pPr>
-        <w:spacing w:after="120" w:before="0" w:line="360" w:lineRule="auto"/>
-        <w:jc w:val="both"/>
-      </w:pPr>
-      <w:r>
-        <w:rPr>
-          <w:rFonts w:ascii="Times New Roman" w:cs="Times New Roman" w:eastAsia="Times New Roman" w:hAnsi="Times New Roman"/>
-          <w:b w:val="false"/>
-          <w:bCs w:val="false"/>
-          <w:i w:val="false"/>
-          <w:iCs w:val="false"/>
-          <w:sz w:val="24"/>
-          <w:szCs w:val="24"/>
-        </w:rPr>
         <w:t xml:space="preserve">En conjunto, los tres experimentos apuntan a la misma conclusión de la sección 7: el cuello de botella no es la arquitectura (Conv1D+BiLSTM y TCN funcionan de forma comparable cuando hay datos suficientes) sino la cantidad de muestras etiquetadas disponibles por clase.</w:t>
       </w:r>
     </w:p>
@@ -6038,15 +6082,10 @@
       </w:pPr>
       <w:r>
         <w:rPr>
-          <w:rFonts w:ascii="Times New Roman" w:cs="Times New Roman" w:eastAsia="Times New Roman" w:hAnsi="Times New Roman"/>
-          <w:b w:val="false"/>
-          <w:bCs w:val="false"/>
-          <w:i w:val="false"/>
-          <w:iCs w:val="false"/>
-          <w:sz w:val="24"/>
-          <w:szCs w:val="24"/>
-        </w:rPr>
-        <w:t>El repositorio conserva un reporte de un modelo de abecedario con 26 clases, 6,692 muestras de entrenamiento, 356 de validación y 356 de prueba. Ese reporte registra una precisión de prueba de 98.60%; debe conservarse como resultado de ese experimento específico y no generalizarse automáticamente a la interfaz actual.</w:t>
+          <w:rFonts w:ascii="Times New Roman" w:hAnsi="Times New Roman"/>
+          <w:sz w:val="24"/>
+        </w:rPr>
+        <w:t>El repositorio conserva ahora un resultado final del modelo de abecedario: 21 letras, 196,065 muestras de entrenamiento, 41,878 de validación y 41,773 de prueba; accuracy de prueba 98.78% y macro-F1 98.79%. La cifra corresponde a ese conjunto y checkpoint, no a toda la interfaz.</w:t>
       </w:r>
     </w:p>
     <w:p>
@@ -6118,15 +6157,10 @@
       </w:pPr>
       <w:r>
         <w:rPr>
-          <w:rFonts w:ascii="Times New Roman" w:cs="Times New Roman" w:eastAsia="Times New Roman" w:hAnsi="Times New Roman"/>
-          <w:b w:val="false"/>
-          <w:bCs w:val="false"/>
-          <w:i w:val="false"/>
-          <w:iCs w:val="false"/>
-          <w:sz w:val="24"/>
-          <w:szCs w:val="24"/>
-        </w:rPr>
-        <w:t>La cifra del modelo de abecedario no demuestra reconocimiento en cámara. Las métricas deben identificarse por conjunto, partición, participantes, checkpoint y condiciones de evaluación antes de compararlas con nuevos experimentos.</w:t>
+          <w:rFonts w:ascii="Times New Roman" w:hAnsi="Times New Roman"/>
+          <w:sz w:val="24"/>
+        </w:rPr>
+        <w:t>La cifra del modelo de abecedario no demuestra reconocimiento en cámara. Las métricas deben identificarse por conjunto, partición, participantes, checkpoint y condiciones de evaluación antes de compararlas con nuevos experimentos. El resultado actualizado debe citarse como 98.78% en prueba y distinguirse del modelo dinámico de 96.67%.</w:t>
       </w:r>
     </w:p>
     <w:p>
@@ -8303,6 +8337,9 @@
         <w:jc w:val="center"/>
       </w:pPr>
     </w:p>
+    <w:p/>
+    <w:p/>
+    <w:p/>
     <w:p/>
     <w:p/>
     <w:p/>

</xml_diff>

<commit_message>
Corregir figura de keypoints
</commit_message>
<xml_diff>
--- a/docs/protocolos/protocolo_LSM_v25.docx
+++ b/docs/protocolos/protocolo_LSM_v25.docx
@@ -902,50 +902,8 @@
     </w:p>
     <w:p>
       <w:pPr>
-        <w:jc w:val="both"/>
-      </w:pPr>
-      <w:r>
-        <w:t>Figura. Ejemplos de keypoints 3D extraídos para las letras A–F del abecedario LSM.</w:t>
-      </w:r>
-    </w:p>
-    <w:p>
-      <w:pPr>
         <w:jc w:val="center"/>
       </w:pPr>
-      <w:r>
-        <w:drawing>
-          <wp:inline xmlns:a="http://schemas.openxmlformats.org/drawingml/2006/main" xmlns:pic="http://schemas.openxmlformats.org/drawingml/2006/picture">
-            <wp:extent cx="5486400" cy="3605053"/>
-            <wp:docPr id="9" name="Picture 9"/>
-            <wp:cNvGraphicFramePr>
-              <a:graphicFrameLocks noChangeAspect="1"/>
-            </wp:cNvGraphicFramePr>
-            <a:graphic>
-              <a:graphicData uri="http://schemas.openxmlformats.org/drawingml/2006/picture">
-                <pic:pic>
-                  <pic:nvPicPr>
-                    <pic:cNvPr id="0" name="keypoints_abecedario_lsm.png"/>
-                    <pic:cNvPicPr/>
-                  </pic:nvPicPr>
-                  <pic:blipFill>
-                    <a:blip r:embed="rId47"/>
-                    <a:stretch>
-                      <a:fillRect/>
-                    </a:stretch>
-                  </pic:blipFill>
-                  <pic:spPr>
-                    <a:xfrm>
-                      <a:off x="0" y="0"/>
-                      <a:ext cx="5486400" cy="3605053"/>
-                    </a:xfrm>
-                    <a:prstGeom prst="rect"/>
-                  </pic:spPr>
-                </pic:pic>
-              </a:graphicData>
-            </a:graphic>
-          </wp:inline>
-        </w:drawing>
-      </w:r>
     </w:p>
     <w:p>
       <w:pPr>
@@ -5895,40 +5853,6 @@
         <w:spacing w:after="40" w:before="200"/>
         <w:jc w:val="center"/>
       </w:pPr>
-      <w:r>
-        <w:drawing>
-          <wp:inline xmlns:a="http://schemas.openxmlformats.org/drawingml/2006/main" xmlns:pic="http://schemas.openxmlformats.org/drawingml/2006/picture">
-            <wp:extent cx="5486400" cy="1784600"/>
-            <wp:docPr id="8" name="Picture"/>
-            <wp:cNvGraphicFramePr>
-              <a:graphicFrameLocks noChangeAspect="1"/>
-            </wp:cNvGraphicFramePr>
-            <a:graphic>
-              <a:graphicData uri="http://schemas.openxmlformats.org/drawingml/2006/picture">
-                <pic:pic>
-                  <pic:nvPicPr>
-                    <pic:cNvPr id="0" name="image.png"/>
-                    <pic:cNvPicPr/>
-                  </pic:nvPicPr>
-                  <pic:blipFill>
-                    <a:blip r:embed="rId46"/>
-                    <a:stretch>
-                      <a:fillRect/>
-                    </a:stretch>
-                  </pic:blipFill>
-                  <pic:spPr>
-                    <a:xfrm>
-                      <a:off x="0" y="0"/>
-                      <a:ext cx="5486400" cy="1784600"/>
-                    </a:xfrm>
-                    <a:prstGeom prst="rect"/>
-                  </pic:spPr>
-                </pic:pic>
-              </a:graphicData>
-            </a:graphic>
-          </wp:inline>
-        </w:drawing>
-      </w:r>
     </w:p>
     <w:p>
       <w:pPr>

</xml_diff>